<commit_message>
docs: expand user guides with detailed Login Page and Settings Workspace sections
</commit_message>
<xml_diff>
--- a/user_guides/Esderos_Admin_Portal_User_Guide.docx
+++ b/user_guides/Esderos_Admin_Portal_User_Guide.docx
@@ -60,7 +60,7 @@
           <w:sz w:val="22"/>
           <w:szCs w:val="22"/>
         </w:rPr>
-        <w:t xml:space="preserve">Global Security Settings, Term Locking, &amp; Admissions Pipeline CRM</w:t>
+        <w:t xml:space="preserve">Security Governance, Lock Modals, CRM, &amp; Global Settings</w:t>
       </w:r>
     </w:p>
     <w:p>
@@ -95,7 +95,7 @@
           <w:sz w:val="18"/>
           <w:szCs w:val="18"/>
         </w:rPr>
-        <w:t xml:space="preserve">Version 1.0.0 | Date: May 2026</w:t>
+        <w:t xml:space="preserve">Version 1.1.0 | Date: May 2026</w:t>
       </w:r>
     </w:p>
     <w:p>
@@ -109,7 +109,66 @@
         <w:spacing w:after="120" w:before="240"/>
       </w:pPr>
       <w:r>
-        <w:t xml:space="preserve">1. Administrative Overview &amp; Term Security Controls</w:t>
+        <w:t xml:space="preserve">1. Administrator Secure Login &amp; Access Control</w:t>
+      </w:r>
+    </w:p>
+    <w:p>
+      <w:pPr>
+        <w:spacing w:after="240"/>
+      </w:pPr>
+      <w:r>
+        <w:rPr>
+          <w:rFonts w:ascii="Calibri" w:cs="Calibri" w:eastAsia="Calibri" w:hAnsi="Calibri"/>
+          <w:sz w:val="22"/>
+          <w:szCs w:val="22"/>
+        </w:rPr>
+        <w:t xml:space="preserve">Access to the Admin Portal is strictly restricted to authorized Super Admins and Standard Admins. Navigate to the administrator login screen, enter your email and password, and complete the mandatory two-factor email verification code challenge to establish a secure admin session.</w:t>
+      </w:r>
+    </w:p>
+    <w:p>
+      <w:pPr>
+        <w:pStyle w:val="Heading1"/>
+        <w:spacing w:after="120" w:before="240"/>
+      </w:pPr>
+      <w:r>
+        <w:t xml:space="preserve">2. Global Settings Workspace &amp; MFA Enforcement</w:t>
+      </w:r>
+    </w:p>
+    <w:p>
+      <w:pPr>
+        <w:spacing w:after="120"/>
+      </w:pPr>
+      <w:r>
+        <w:rPr>
+          <w:rFonts w:ascii="Calibri" w:cs="Calibri" w:eastAsia="Calibri" w:hAnsi="Calibri"/>
+          <w:sz w:val="22"/>
+          <w:szCs w:val="22"/>
+        </w:rPr>
+        <w:t xml:space="preserve">The Admin Settings portal provides critical institutional controls for configuring portal-wide systems and managing security parameters:</w:t>
+      </w:r>
+    </w:p>
+    <w:p>
+      <w:pPr>
+        <w:spacing w:after="240"/>
+      </w:pPr>
+      <w:r>
+        <w:rPr>
+          <w:rFonts w:ascii="Calibri" w:cs="Calibri" w:eastAsia="Calibri" w:hAnsi="Calibri"/>
+          <w:sz w:val="22"/>
+          <w:szCs w:val="22"/>
+        </w:rPr>
+        <w:t xml:space="preserve">• Global MFA Security Switch: When enabled, all active student, faculty, and administrator logins are globally required to complete Two-Factor Email Verification code checks. This ensures strict institutional data privacy.
+• Seminary System Metrics: Configure system settings, active enrollment periods, admissions windows, and register departments.
+• Security Logs: Track administrator sign-ins, audit credential updates, and monitor enrollment approval records.</w:t>
+      </w:r>
+    </w:p>
+    <w:p>
+      <w:pPr>
+        <w:pStyle w:val="Heading1"/>
+        <w:spacing w:after="120" w:before="240"/>
+      </w:pPr>
+      <w:r>
+        <w:t xml:space="preserve">3. Administrative Overview &amp; Term Security Controls</w:t>
       </w:r>
     </w:p>
     <w:p>
@@ -160,7 +219,7 @@
         <w:spacing w:after="120" w:before="240"/>
       </w:pPr>
       <w:r>
-        <w:t xml:space="preserve">2. Global MFA Security Governance</w:t>
+        <w:t xml:space="preserve">4. Admissions CRM &amp; Sequential ID Pipelines</w:t>
       </w:r>
     </w:p>
     <w:p>
@@ -173,7 +232,7 @@
           <w:sz w:val="22"/>
           <w:szCs w:val="22"/>
         </w:rPr>
-        <w:t xml:space="preserve">Under global Settings, Super Admins can toggle the mandatory MFA switch. When active, all platform users (students, faculty, and administrators) are globally required to use two-factor email verification code checks upon login.</w:t>
+        <w:t xml:space="preserve">The Admissions portal manages applicant pipelines. Admins can review uploaded academic transcripts, verify files, and approve or reject submissions. Approved applicants are automatically assigned department-linked sequential IDs (e.g. THEO-0001, SEML-0002) for structured cohort organization.</w:t>
       </w:r>
     </w:p>
     <w:p>
@@ -182,29 +241,7 @@
         <w:spacing w:after="120" w:before="240"/>
       </w:pPr>
       <w:r>
-        <w:t xml:space="preserve">3. Admissions CRM &amp; Sequential ID Pipelines</w:t>
-      </w:r>
-    </w:p>
-    <w:p>
-      <w:pPr>
-        <w:spacing w:after="240"/>
-      </w:pPr>
-      <w:r>
-        <w:rPr>
-          <w:rFonts w:ascii="Calibri" w:cs="Calibri" w:eastAsia="Calibri" w:hAnsi="Calibri"/>
-          <w:sz w:val="22"/>
-          <w:szCs w:val="22"/>
-        </w:rPr>
-        <w:t xml:space="preserve">The Admissions portal manages applicant pipelines. Admins can review uploaded academic transcripts, verify files, and approve or reject submissions. Approved applicants are automatically assigned department-linked sequential IDs (e.g. THEO-0001, SEML-0002) for structured cohort organization.</w:t>
-      </w:r>
-    </w:p>
-    <w:p>
-      <w:pPr>
-        <w:pStyle w:val="Heading1"/>
-        <w:spacing w:after="120" w:before="240"/>
-      </w:pPr>
-      <w:r>
-        <w:t xml:space="preserve">4. Student Cohort Imports &amp; Alumni Migrations</w:t>
+        <w:t xml:space="preserve">5. Student Cohort Imports &amp; Alumni Migrations</w:t>
       </w:r>
     </w:p>
     <w:p>

</xml_diff>